<commit_message>
feat: catalog pdf cover & back cover update, remove footer on all object pages, add Esc scroll-to-top and exact thumbnail return, generate Word letterheads var1 and var2, restore 2-button footer in light tones
</commit_message>
<xml_diff>
--- a/site/assets/blank_var1_top_requisites.docx
+++ b/site/assets/blank_var1_top_requisites.docx
@@ -75,12 +75,12 @@
     </w:p>
     <w:p>
       <w:pPr>
-        <w:spacing w:before="320" w:after="0"/>
+        <w:spacing w:before="280" w:after="0"/>
       </w:pPr>
     </w:p>
     <w:p>
       <w:pPr>
-        <w:spacing w:before="0" w:after="560"/>
+        <w:spacing w:before="0" w:after="480"/>
       </w:pPr>
       <w:r>
         <w:rPr>
@@ -120,7 +120,7 @@
     </w:p>
     <w:p>
       <w:pPr>
-        <w:spacing w:before="0" w:after="800" w:line="300" w:lineRule="exact"/>
+        <w:spacing w:before="0" w:after="720" w:line="300" w:lineRule="exact"/>
       </w:pPr>
       <w:r>
         <w:rPr>
@@ -133,7 +133,7 @@
     </w:p>
     <w:p>
       <w:pPr>
-        <w:spacing w:before="800" w:after="80"/>
+        <w:spacing w:before="600" w:after="80"/>
       </w:pPr>
       <w:r>
         <w:rPr>

</xml_diff>